<commit_message>
Save updated base design document
</commit_message>
<xml_diff>
--- a/Natural_Selection_Simulation.docx
+++ b/Natural_Selection_Simulation.docx
@@ -38,26 +38,39 @@
         <w:t xml:space="preserve"> The future intention is to simulate </w:t>
       </w:r>
       <w:r>
-        <w:t>psychological</w:t>
-      </w:r>
-      <w:r>
-        <w:t xml:space="preserve"> </w:t>
-      </w:r>
-      <w:r>
-        <w:t xml:space="preserve">evolution not biological evolution. Something like the “NEAT” </w:t>
+        <w:t xml:space="preserve">psychological </w:t>
+      </w:r>
+      <w:r>
+        <w:t>evolution not biological evolution. Some</w:t>
+      </w:r>
+      <w:r>
+        <w:t xml:space="preserve"> kind of variation of </w:t>
+      </w:r>
+      <w:r>
+        <w:t xml:space="preserve">the NEAT </w:t>
       </w:r>
       <w:r>
         <w:t xml:space="preserve">research </w:t>
       </w:r>
       <w:r>
-        <w:t xml:space="preserve">work. </w:t>
+        <w:t>project</w:t>
+      </w:r>
+      <w:r>
+        <w:t xml:space="preserve">. </w:t>
       </w:r>
       <w:r>
         <w:br/>
+        <w:t xml:space="preserve">NEAT - </w:t>
+      </w:r>
+      <w:r>
+        <w:t>https://en.wikipedia.org/wiki/Neuroevolution_of_augmenting_topologies</w:t>
+      </w:r>
+      <w:r>
+        <w:br/>
       </w:r>
       <w:r>
         <w:pict w14:anchorId="5E8D290F">
-          <v:rect id="_x0000_i1025" style="width:0;height:1.5pt" o:hralign="center" o:hrstd="t" o:hr="t" fillcolor="#a0a0a0" stroked="f"/>
+          <v:rect id="_x0000_i1026" style="width:0;height:1.5pt" o:hralign="center" o:hrstd="t" o:hr="t" fillcolor="#a0a0a0" stroked="f"/>
         </w:pict>
       </w:r>
     </w:p>
@@ -86,10 +99,7 @@
         <w:t>world</w:t>
       </w:r>
       <w:r>
-        <w:t xml:space="preserve"> made by a </w:t>
-      </w:r>
-      <w:r>
-        <w:t>grid</w:t>
+        <w:t xml:space="preserve"> made by a grid</w:t>
       </w:r>
       <w:r>
         <w:t xml:space="preserve"> of </w:t>
@@ -208,7 +218,7 @@
     <w:p>
       <w:r>
         <w:pict w14:anchorId="686D203B">
-          <v:rect id="_x0000_i1026" style="width:0;height:1.5pt" o:hralign="center" o:hrstd="t" o:hr="t" fillcolor="#a0a0a0" stroked="f"/>
+          <v:rect id="_x0000_i1027" style="width:0;height:1.5pt" o:hralign="center" o:hrstd="t" o:hr="t" fillcolor="#a0a0a0" stroked="f"/>
         </w:pict>
       </w:r>
     </w:p>
@@ -226,8 +236,6 @@
       </w:r>
       <w:r>
         <w:br/>
-      </w:r>
-      <w:r>
         <w:t>sense</w:t>
       </w:r>
       <w:r>
@@ -354,6 +362,7 @@
                 <w:b/>
                 <w:bCs/>
               </w:rPr>
+              <w:lastRenderedPageBreak/>
               <w:t>Attribute</w:t>
             </w:r>
           </w:p>
@@ -566,7 +575,6 @@
                 <w:bCs/>
               </w:rPr>
             </w:pPr>
-            <w:proofErr w:type="spellStart"/>
             <w:r>
               <w:rPr>
                 <w:b/>
@@ -574,7 +582,6 @@
               </w:rPr>
               <w:t>GenCount</w:t>
             </w:r>
-            <w:proofErr w:type="spellEnd"/>
           </w:p>
         </w:tc>
         <w:tc>
@@ -583,13 +590,8 @@
             <w:vAlign w:val="center"/>
           </w:tcPr>
           <w:p>
-            <w:proofErr w:type="spellStart"/>
-            <w:r>
-              <w:t>GenCount</w:t>
-            </w:r>
-            <w:proofErr w:type="spellEnd"/>
-            <w:r>
-              <w:t xml:space="preserve"> = </w:t>
+            <w:r>
+              <w:t xml:space="preserve">GenCount = </w:t>
             </w:r>
             <w:proofErr w:type="gramStart"/>
             <w:r>
@@ -597,23 +599,7 @@
             </w:r>
             <w:proofErr w:type="gramEnd"/>
             <w:r>
-              <w:t xml:space="preserve">mother's </w:t>
-            </w:r>
-            <w:proofErr w:type="spellStart"/>
-            <w:r>
-              <w:t>GenCount</w:t>
-            </w:r>
-            <w:proofErr w:type="spellEnd"/>
-            <w:r>
-              <w:t xml:space="preserve">, father's </w:t>
-            </w:r>
-            <w:proofErr w:type="spellStart"/>
-            <w:r>
-              <w:t>GenCount</w:t>
-            </w:r>
-            <w:proofErr w:type="spellEnd"/>
-            <w:r>
-              <w:t>) + 1</w:t>
+              <w:t>mother's GenCount, father's GenCount) + 1</w:t>
             </w:r>
           </w:p>
         </w:tc>
@@ -669,23 +655,7 @@
           </w:tcPr>
           <w:p>
             <w:r>
-              <w:t xml:space="preserve">Configurable </w:t>
-            </w:r>
-            <w:proofErr w:type="spellStart"/>
-            <w:r>
-              <w:t>X_strength</w:t>
-            </w:r>
-            <w:proofErr w:type="spellEnd"/>
-            <w:r>
-              <w:t xml:space="preserve"> ± Gaussian noise (</w:t>
-            </w:r>
-            <w:proofErr w:type="spellStart"/>
-            <w:r>
-              <w:t>σ_init</w:t>
-            </w:r>
-            <w:proofErr w:type="spellEnd"/>
-            <w:r>
-              <w:t>)</w:t>
+              <w:t>Configurable X_strength ± Gaussian noise (σ_init)</w:t>
             </w:r>
           </w:p>
         </w:tc>
@@ -730,15 +700,7 @@
           </w:tcPr>
           <w:p>
             <w:r>
-              <w:t>Configurable K ± Gaussian noise (</w:t>
-            </w:r>
-            <w:proofErr w:type="spellStart"/>
-            <w:r>
-              <w:t>σ_init</w:t>
-            </w:r>
-            <w:proofErr w:type="spellEnd"/>
-            <w:r>
-              <w:t>)</w:t>
+              <w:t>Configurable K ± Gaussian noise (σ_init)</w:t>
             </w:r>
           </w:p>
         </w:tc>
@@ -1017,7 +979,7 @@
     <w:p>
       <w:r>
         <w:pict w14:anchorId="3D7A53F8">
-          <v:rect id="_x0000_i1027" style="width:0;height:1.5pt" o:hralign="center" o:hrstd="t" o:hr="t" fillcolor="#a0a0a0" stroked="f"/>
+          <v:rect id="_x0000_i1028" style="width:0;height:1.5pt" o:hralign="center" o:hrstd="t" o:hr="t" fillcolor="#a0a0a0" stroked="f"/>
         </w:pict>
       </w:r>
     </w:p>
@@ -1084,7 +1046,7 @@
     <w:p>
       <w:r>
         <w:pict w14:anchorId="18F43773">
-          <v:rect id="_x0000_i1028" style="width:0;height:1.5pt" o:hralign="center" o:hrstd="t" o:hr="t" fillcolor="#a0a0a0" stroked="f"/>
+          <v:rect id="_x0000_i1029" style="width:0;height:1.5pt" o:hralign="center" o:hrstd="t" o:hr="t" fillcolor="#a0a0a0" stroked="f"/>
         </w:pict>
       </w:r>
     </w:p>
@@ -1109,6 +1071,7 @@
         </w:numPr>
       </w:pPr>
       <w:r>
+        <w:lastRenderedPageBreak/>
         <w:t xml:space="preserve">Move one cell in any of </w:t>
       </w:r>
       <w:r>
@@ -1140,7 +1103,7 @@
     <w:p>
       <w:r>
         <w:pict w14:anchorId="6BFFEEE5">
-          <v:rect id="_x0000_i1029" style="width:0;height:1.5pt" o:hralign="center" o:hrstd="t" o:hr="t" fillcolor="#a0a0a0" stroked="f"/>
+          <v:rect id="_x0000_i1030" style="width:0;height:1.5pt" o:hralign="center" o:hrstd="t" o:hr="t" fillcolor="#a0a0a0" stroked="f"/>
         </w:pict>
       </w:r>
     </w:p>
@@ -1340,21 +1303,7 @@
         <w:rPr>
           <w:lang w:val="en-US"/>
         </w:rPr>
-        <w:t xml:space="preserve">If there are in </w:t>
-      </w:r>
-      <w:proofErr w:type="spellStart"/>
-      <w:r>
-        <w:rPr>
-          <w:lang w:val="en-US"/>
-        </w:rPr>
-        <w:t>vx</w:t>
-      </w:r>
-      <w:proofErr w:type="spellEnd"/>
-      <w:r>
-        <w:rPr>
-          <w:lang w:val="en-US"/>
-        </w:rPr>
-        <w:t xml:space="preserve"> more than the nearest the extra vision will be in the direction of vision. See demonstration below. </w:t>
+        <w:t xml:space="preserve">If there are in vx more than the nearest the extra vision will be in the direction of vision. See demonstration below. </w:t>
       </w:r>
     </w:p>
     <w:p>
@@ -1398,15 +1347,7 @@
         </w:numPr>
       </w:pPr>
       <w:r>
-        <w:t>Let </w:t>
-      </w:r>
-      <w:proofErr w:type="spellStart"/>
-      <w:r>
-        <w:t>baseSide</w:t>
-      </w:r>
-      <w:proofErr w:type="spellEnd"/>
-      <w:r>
-        <w:t xml:space="preserve"> = floor(</w:t>
+        <w:t>Let baseSide = floor(</w:t>
       </w:r>
       <w:proofErr w:type="gramStart"/>
       <w:r>
@@ -1425,31 +1366,7 @@
         </w:numPr>
       </w:pPr>
       <w:r>
-        <w:t>Use a </w:t>
-      </w:r>
-      <w:proofErr w:type="spellStart"/>
-      <w:r>
-        <w:t>baseSide</w:t>
-      </w:r>
-      <w:proofErr w:type="spellEnd"/>
-      <w:r>
-        <w:t xml:space="preserve"> × </w:t>
-      </w:r>
-      <w:proofErr w:type="spellStart"/>
-      <w:r>
-        <w:t>baseSide</w:t>
-      </w:r>
-      <w:proofErr w:type="spellEnd"/>
-      <w:r>
-        <w:t xml:space="preserve"> square </w:t>
-      </w:r>
-      <w:proofErr w:type="spellStart"/>
-      <w:r>
-        <w:t>centered</w:t>
-      </w:r>
-      <w:proofErr w:type="spellEnd"/>
-      <w:r>
-        <w:t xml:space="preserve"> in the vision direction.</w:t>
+        <w:t>Use a baseSide × baseSide square centered in the vision direction.</w:t>
       </w:r>
       <w:r>
         <w:t xml:space="preserve"> The vision square touches the monkey cell but the monkey cell is not in the vision square. </w:t>
@@ -1487,6 +1404,7 @@
     </w:p>
     <w:p>
       <w:r>
+        <w:lastRenderedPageBreak/>
         <w:t xml:space="preserve">To demonstrate far/near vision. It is defined by c above. The cell with draw of X is where the monkey stands. </w:t>
       </w:r>
       <w:proofErr w:type="gramStart"/>
@@ -1495,15 +1413,7 @@
       </w:r>
       <w:proofErr w:type="gramEnd"/>
       <w:r>
-        <w:t xml:space="preserve"> assume </w:t>
-      </w:r>
-      <w:proofErr w:type="spellStart"/>
-      <w:r>
-        <w:t>vx</w:t>
-      </w:r>
-      <w:proofErr w:type="spellEnd"/>
-      <w:r>
-        <w:t>=9 and vision direction is vertical up.</w:t>
+        <w:t xml:space="preserve"> assume vx=9 and vision direction is vertical up.</w:t>
       </w:r>
       <w:r>
         <w:br/>
@@ -1833,7 +1743,7 @@
     <w:p>
       <w:r>
         <w:pict w14:anchorId="547CC944">
-          <v:rect id="_x0000_i1045" style="width:0;height:1.5pt" o:hralign="center" o:bullet="t" o:hrstd="t" o:hr="t" fillcolor="#a0a0a0" stroked="f"/>
+          <v:rect id="_x0000_i1031" style="width:0;height:1.5pt" o:hralign="center" o:bullet="t" o:hrstd="t" o:hr="t" fillcolor="#a0a0a0" stroked="f"/>
         </w:pict>
       </w:r>
     </w:p>
@@ -1851,26 +1761,10 @@
       </w:r>
       <w:r>
         <w:br/>
-      </w:r>
-      <w:r>
-        <w:t xml:space="preserve">Memory </w:t>
-      </w:r>
-      <w:r>
-        <w:t>is</w:t>
-      </w:r>
-      <w:r>
-        <w:t xml:space="preserve"> a fixed set of relative coordinates </w:t>
-      </w:r>
-      <w:r>
-        <w:t xml:space="preserve">of cells </w:t>
-      </w:r>
-      <w:r>
-        <w:t>around the monkey.</w:t>
+        <w:t>Memory is a fixed set of relative coordinates of cells around the monkey.</w:t>
       </w:r>
       <w:r>
         <w:br/>
-      </w:r>
-      <w:r>
         <w:t>For Vx = 9, memory is 6 × Vx = 54 slots.</w:t>
       </w:r>
     </w:p>
@@ -2022,12 +1916,7 @@
       </w:r>
       <w:r>
         <w:br/>
-      </w:r>
-      <w:r>
-        <w:t>Board delivers vision results to monkey</w:t>
-      </w:r>
-      <w:r>
-        <w:t xml:space="preserve"> by relative to the monkey. The monkey never knows where he is in the world (that is important for future) when monkey is near border</w:t>
+        <w:t>Board delivers vision results to monkey by relative to the monkey. The monkey never knows where he is in the world (that is important for future) when monkey is near border</w:t>
       </w:r>
       <w:r>
         <w:t xml:space="preserve"> he “sees” cells outside of board as pointers to monkeys with Id=0. That is not a monkey.</w:t>
@@ -2036,7 +1925,7 @@
     <w:p>
       <w:r>
         <w:pict w14:anchorId="52421C21">
-          <v:rect id="_x0000_i1031" style="width:0;height:1.5pt" o:hralign="center" o:hrstd="t" o:hr="t" fillcolor="#a0a0a0" stroked="f"/>
+          <v:rect id="_x0000_i1032" style="width:0;height:1.5pt" o:hralign="center" o:hrstd="t" o:hr="t" fillcolor="#a0a0a0" stroked="f"/>
         </w:pict>
       </w:r>
     </w:p>
@@ -2045,6 +1934,7 @@
         <w:pStyle w:val="Heading4"/>
       </w:pPr>
       <w:r>
+        <w:lastRenderedPageBreak/>
         <w:t>7. Cell Occupancy Rules</w:t>
       </w:r>
     </w:p>
@@ -2159,16 +2049,13 @@
         <w:t xml:space="preserve"> World replies with “mating in place”</w:t>
       </w:r>
       <w:r>
-        <w:t xml:space="preserve">. </w:t>
-      </w:r>
-      <w:r>
-        <w:t>monkey will store that in the memory slot for this cell.</w:t>
+        <w:t>. monkey will store that in the memory slot for this cell.</w:t>
       </w:r>
     </w:p>
     <w:p>
       <w:r>
         <w:pict w14:anchorId="4D3E0371">
-          <v:rect id="_x0000_i1032" style="width:0;height:1.5pt" o:hralign="center" o:hrstd="t" o:hr="t" fillcolor="#a0a0a0" stroked="f"/>
+          <v:rect id="_x0000_i1033" style="width:0;height:1.5pt" o:hralign="center" o:hrstd="t" o:hr="t" fillcolor="#a0a0a0" stroked="f"/>
         </w:pict>
       </w:r>
     </w:p>
@@ -2298,21 +2185,12 @@
       <w:r>
         <w:t xml:space="preserve">Both monkeys lose </w:t>
       </w:r>
-      <w:proofErr w:type="spellStart"/>
       <w:r>
         <w:rPr>
           <w:b/>
           <w:bCs/>
         </w:rPr>
-        <w:t>X_mating_cost</w:t>
-      </w:r>
-      <w:proofErr w:type="spellEnd"/>
-      <w:r>
-        <w:rPr>
-          <w:b/>
-          <w:bCs/>
-        </w:rPr>
-        <w:t xml:space="preserve"> turns</w:t>
+        <w:t>X_mating_cost turns</w:t>
       </w:r>
       <w:r>
         <w:t xml:space="preserve"> from remaining lifespan.</w:t>
@@ -2494,42 +2372,11 @@
       </w:r>
       <w:proofErr w:type="gramEnd"/>
       <w:r>
-        <w:t>-(</w:t>
-      </w:r>
-      <w:proofErr w:type="spellStart"/>
-      <w:r>
-        <w:t>StrengthA</w:t>
-      </w:r>
-      <w:proofErr w:type="spellEnd"/>
-      <w:r>
-        <w:t xml:space="preserve"> - </w:t>
-      </w:r>
-      <w:proofErr w:type="spellStart"/>
-      <w:r>
-        <w:t>StrengthB</w:t>
-      </w:r>
-      <w:proofErr w:type="spellEnd"/>
-      <w:r>
-        <w:t xml:space="preserve">) / </w:t>
-      </w:r>
-      <w:proofErr w:type="spellStart"/>
-      <w:r>
-        <w:t>sigma_combat</w:t>
-      </w:r>
-      <w:proofErr w:type="spellEnd"/>
-      <w:r>
-        <w:t>))</w:t>
+        <w:t>-(StrengthA - StrengthB) / sigma_combat))</w:t>
       </w:r>
       <w:r>
         <w:br/>
-      </w:r>
-      <w:proofErr w:type="spellStart"/>
-      <w:r>
-        <w:t>sigma_combat</w:t>
-      </w:r>
-      <w:proofErr w:type="spellEnd"/>
-      <w:r>
-        <w:t xml:space="preserve"> configurable starts as 10.</w:t>
+        <w:t>sigma_combat configurable starts as 10.</w:t>
       </w:r>
     </w:p>
     <w:p>
@@ -2542,35 +2389,19 @@
       <w:r>
         <w:t xml:space="preserve">Winner gains </w:t>
       </w:r>
-      <w:proofErr w:type="spellStart"/>
       <w:r>
         <w:rPr>
           <w:b/>
           <w:bCs/>
         </w:rPr>
-        <w:t>X_combat_gain</w:t>
-      </w:r>
-      <w:proofErr w:type="spellEnd"/>
-      <w:r>
-        <w:rPr>
-          <w:b/>
-          <w:bCs/>
-        </w:rPr>
-        <w:t xml:space="preserve"> %</w:t>
+        <w:t>X_combat_gain %</w:t>
       </w:r>
       <w:r>
         <w:t xml:space="preserve"> of the loser's strength.</w:t>
       </w:r>
       <w:r>
         <w:br/>
-      </w:r>
-      <w:proofErr w:type="spellStart"/>
-      <w:r>
-        <w:t>X_combat_gain</w:t>
-      </w:r>
-      <w:proofErr w:type="spellEnd"/>
-      <w:r>
-        <w:t xml:space="preserve"> configurable starts as 10</w:t>
+        <w:t>X_combat_gain configurable starts as 10</w:t>
       </w:r>
     </w:p>
     <w:p>
@@ -2581,6 +2412,7 @@
         </w:numPr>
       </w:pPr>
       <w:r>
+        <w:lastRenderedPageBreak/>
         <w:t xml:space="preserve">Loser </w:t>
       </w:r>
       <w:r>
@@ -2608,7 +2440,7 @@
     <w:p>
       <w:r>
         <w:pict w14:anchorId="5F16DDA4">
-          <v:rect id="_x0000_i1033" style="width:0;height:1.5pt" o:hralign="center" o:hrstd="t" o:hr="t" fillcolor="#a0a0a0" stroked="f"/>
+          <v:rect id="_x0000_i1034" style="width:0;height:1.5pt" o:hralign="center" o:hrstd="t" o:hr="t" fillcolor="#a0a0a0" stroked="f"/>
         </w:pict>
       </w:r>
     </w:p>
@@ -2720,7 +2552,7 @@
     <w:p>
       <w:r>
         <w:pict w14:anchorId="0B41C362">
-          <v:rect id="_x0000_i1034" style="width:0;height:1.5pt" o:hralign="center" o:hrstd="t" o:hr="t" fillcolor="#a0a0a0" stroked="f"/>
+          <v:rect id="_x0000_i1035" style="width:0;height:1.5pt" o:hralign="center" o:hrstd="t" o:hr="t" fillcolor="#a0a0a0" stroked="f"/>
         </w:pict>
       </w:r>
     </w:p>
@@ -2741,23 +2573,7 @@
           <w:b/>
           <w:bCs/>
         </w:rPr>
-        <w:t>average of both parents + Gaussian noise (</w:t>
-      </w:r>
-      <w:proofErr w:type="spellStart"/>
-      <w:r>
-        <w:rPr>
-          <w:b/>
-          <w:bCs/>
-        </w:rPr>
-        <w:t>σ_mutation</w:t>
-      </w:r>
-      <w:proofErr w:type="spellEnd"/>
-      <w:r>
-        <w:rPr>
-          <w:b/>
-          <w:bCs/>
-        </w:rPr>
-        <w:t>)</w:t>
+        <w:t>average of both parents + Gaussian noise (σ_mutation)</w:t>
       </w:r>
     </w:p>
     <w:tbl>
@@ -2859,13 +2675,8 @@
             </w:r>
             <w:proofErr w:type="gramEnd"/>
             <w:r>
-              <w:t xml:space="preserve">mother, father) + </w:t>
-            </w:r>
-            <w:proofErr w:type="spellStart"/>
-            <w:r>
-              <w:t>σ_mutation</w:t>
-            </w:r>
-            <w:proofErr w:type="spellEnd"/>
+              <w:t>mother, father) + σ_mutation</w:t>
+            </w:r>
           </w:p>
         </w:tc>
       </w:tr>
@@ -2902,13 +2713,8 @@
             </w:r>
             <w:proofErr w:type="gramEnd"/>
             <w:r>
-              <w:t xml:space="preserve">mother, father) + </w:t>
-            </w:r>
-            <w:proofErr w:type="spellStart"/>
-            <w:r>
-              <w:t>σ_mutation</w:t>
-            </w:r>
-            <w:proofErr w:type="spellEnd"/>
+              <w:t>mother, father) + σ_mutation</w:t>
+            </w:r>
           </w:p>
         </w:tc>
       </w:tr>
@@ -2945,13 +2751,8 @@
             </w:r>
             <w:proofErr w:type="gramEnd"/>
             <w:r>
-              <w:t xml:space="preserve">mother, father) + </w:t>
-            </w:r>
-            <w:proofErr w:type="spellStart"/>
-            <w:r>
-              <w:t>σ_mutation</w:t>
-            </w:r>
-            <w:proofErr w:type="spellEnd"/>
+              <w:t>mother, father) + σ_mutation</w:t>
+            </w:r>
           </w:p>
         </w:tc>
       </w:tr>
@@ -2986,15 +2787,7 @@
               <w:t xml:space="preserve">NN weights are inherited by crossover: each weight is copied from either mother or father with 50/50 probability, then Gaussian mutation </w:t>
             </w:r>
             <w:r>
-              <w:t>(</w:t>
-            </w:r>
-            <w:proofErr w:type="spellStart"/>
-            <w:r>
-              <w:t>σ_mutation</w:t>
-            </w:r>
-            <w:proofErr w:type="spellEnd"/>
-            <w:r>
-              <w:t xml:space="preserve">) </w:t>
+              <w:t xml:space="preserve">(σ_mutation) </w:t>
             </w:r>
             <w:r>
               <w:t>is applied.</w:t>
@@ -3076,13 +2869,8 @@
           <w:numId w:val="10"/>
         </w:numPr>
       </w:pPr>
-      <w:proofErr w:type="spellStart"/>
-      <w:r>
-        <w:t>raw_child</w:t>
-      </w:r>
-      <w:proofErr w:type="spellEnd"/>
-      <w:r>
-        <w:t>_</w:t>
+      <w:r>
+        <w:t>raw_child_</w:t>
       </w:r>
       <w:r>
         <w:rPr>
@@ -3134,14 +2922,9 @@
       <w:r>
         <w:t>clamp(</w:t>
       </w:r>
-      <w:proofErr w:type="spellStart"/>
       <w:proofErr w:type="gramEnd"/>
       <w:r>
-        <w:t>raw_child</w:t>
-      </w:r>
-      <w:proofErr w:type="spellEnd"/>
-      <w:r>
-        <w:t>_</w:t>
+        <w:t>raw_child_</w:t>
       </w:r>
       <w:r>
         <w:rPr>
@@ -3178,7 +2961,7 @@
     <w:p>
       <w:r>
         <w:pict w14:anchorId="74F1422B">
-          <v:rect id="_x0000_i1035" style="width:0;height:1.5pt" o:hralign="center" o:hrstd="t" o:hr="t" fillcolor="#a0a0a0" stroked="f"/>
+          <v:rect id="_x0000_i1036" style="width:0;height:1.5pt" o:hralign="center" o:hrstd="t" o:hr="t" fillcolor="#a0a0a0" stroked="f"/>
         </w:pict>
       </w:r>
     </w:p>
@@ -3251,6 +3034,7 @@
         </w:numPr>
       </w:pPr>
       <w:r>
+        <w:lastRenderedPageBreak/>
         <w:t xml:space="preserve">Its remaining </w:t>
       </w:r>
       <w:r>
@@ -3266,15 +3050,7 @@
     </w:p>
     <w:p>
       <w:r>
-        <w:t xml:space="preserve">The game ends (This should not be normal in good ecology) and the NN of longest </w:t>
-      </w:r>
-      <w:proofErr w:type="spellStart"/>
-      <w:r>
-        <w:t>GenCount</w:t>
-      </w:r>
-      <w:proofErr w:type="spellEnd"/>
-      <w:r>
-        <w:t xml:space="preserve"> is written to file if:</w:t>
+        <w:t>The game ends (This should not be normal in good ecology) and the NN of longest GenCount is written to file if:</w:t>
       </w:r>
     </w:p>
     <w:p>
@@ -3304,7 +3080,7 @@
     <w:p>
       <w:r>
         <w:pict w14:anchorId="668454F8">
-          <v:rect id="_x0000_i1036" style="width:0;height:1.5pt" o:hralign="center" o:hrstd="t" o:hr="t" fillcolor="#a0a0a0" stroked="f"/>
+          <v:rect id="_x0000_i1037" style="width:0;height:1.5pt" o:hralign="center" o:hrstd="t" o:hr="t" fillcolor="#a0a0a0" stroked="f"/>
         </w:pict>
       </w:r>
     </w:p>
@@ -3641,7 +3417,6 @@
     </w:p>
     <w:p>
       <w:r>
-        <w:lastRenderedPageBreak/>
         <w:t>Reason for 4 layers (input + 3 hidden + output) is reasonable for this problem. The creature needs to:</w:t>
       </w:r>
     </w:p>
@@ -3737,15 +3512,8 @@
         </w:numPr>
       </w:pPr>
       <w:r>
-        <w:t xml:space="preserve">NN weights of one of the monkeys with the biggest </w:t>
-      </w:r>
-      <w:proofErr w:type="spellStart"/>
-      <w:r>
-        <w:t>GenCount</w:t>
-      </w:r>
-      <w:proofErr w:type="spellEnd"/>
-      <w:r>
-        <w:t xml:space="preserve"> are stored in a file </w:t>
+        <w:lastRenderedPageBreak/>
+        <w:t xml:space="preserve">NN weights of one of the monkeys with the biggest GenCount are stored in a file </w:t>
       </w:r>
       <w:proofErr w:type="gramStart"/>
       <w:r>
@@ -3843,7 +3611,7 @@
       </w:r>
       <w:r>
         <w:pict w14:anchorId="7DBC96EA">
-          <v:rect id="_x0000_i1037" style="width:0;height:1.5pt" o:hralign="center" o:hrstd="t" o:hr="t" fillcolor="#a0a0a0" stroked="f"/>
+          <v:rect id="_x0000_i1038" style="width:0;height:1.5pt" o:hralign="center" o:hrstd="t" o:hr="t" fillcolor="#a0a0a0" stroked="f"/>
         </w:pict>
       </w:r>
     </w:p>
@@ -3919,7 +3687,7 @@
     <w:p>
       <w:r>
         <w:pict w14:anchorId="46F693A1">
-          <v:rect id="_x0000_i1038" style="width:0;height:1.5pt" o:hralign="center" o:hrstd="t" o:hr="t" fillcolor="#a0a0a0" stroked="f"/>
+          <v:rect id="_x0000_i1039" style="width:0;height:1.5pt" o:hralign="center" o:hrstd="t" o:hr="t" fillcolor="#a0a0a0" stroked="f"/>
         </w:pict>
       </w:r>
     </w:p>
@@ -3952,7 +3720,7 @@
     <w:p>
       <w:r>
         <w:pict w14:anchorId="7C8A74CE">
-          <v:rect id="_x0000_i1039" style="width:0;height:1.5pt" o:hralign="center" o:hrstd="t" o:hr="t" fillcolor="#a0a0a0" stroked="f"/>
+          <v:rect id="_x0000_i1040" style="width:0;height:1.5pt" o:hralign="center" o:hrstd="t" o:hr="t" fillcolor="#a0a0a0" stroked="f"/>
         </w:pict>
       </w:r>
     </w:p>
@@ -4134,21 +3902,8 @@
             <w:hideMark/>
           </w:tcPr>
           <w:p>
-            <w:proofErr w:type="spellStart"/>
-            <w:r>
-              <w:t>X_strength</w:t>
-            </w:r>
-            <w:proofErr w:type="spellEnd"/>
-            <w:r>
-              <w:t xml:space="preserve"> ± Gaussian noise (</w:t>
-            </w:r>
-            <w:proofErr w:type="spellStart"/>
-            <w:r>
-              <w:t>σ_init</w:t>
-            </w:r>
-            <w:proofErr w:type="spellEnd"/>
-            <w:r>
-              <w:t>). clamped (0.5x, 3x)</w:t>
+            <w:r>
+              <w:t>X_strength ± Gaussian noise (σ_init). clamped (0.5x, 3x)</w:t>
             </w:r>
           </w:p>
         </w:tc>
@@ -4181,15 +3936,7 @@
           </w:tcPr>
           <w:p>
             <w:r>
-              <w:t>K ± Gaussian noise (</w:t>
-            </w:r>
-            <w:proofErr w:type="spellStart"/>
-            <w:r>
-              <w:t>σ_init</w:t>
-            </w:r>
-            <w:proofErr w:type="spellEnd"/>
-            <w:r>
-              <w:t>) clamped (0.5x, 3x)</w:t>
+              <w:t>K ± Gaussian noise (σ_init) clamped (0.5x, 3x)</w:t>
             </w:r>
           </w:p>
         </w:tc>
@@ -4329,8 +4076,9 @@
     </w:tbl>
     <w:p>
       <w:r>
+        <w:lastRenderedPageBreak/>
         <w:pict w14:anchorId="66B00390">
-          <v:rect id="_x0000_i1040" style="width:0;height:1.5pt" o:hralign="center" o:hrstd="t" o:hr="t" fillcolor="#a0a0a0" stroked="f"/>
+          <v:rect id="_x0000_i1041" style="width:0;height:1.5pt" o:hralign="center" o:hrstd="t" o:hr="t" fillcolor="#a0a0a0" stroked="f"/>
         </w:pict>
       </w:r>
     </w:p>
@@ -4442,15 +4190,7 @@
         <w:t>world</w:t>
       </w:r>
       <w:r>
-        <w:t xml:space="preserve"> runs as a process. Each monkey communicates via </w:t>
-      </w:r>
-      <w:proofErr w:type="spellStart"/>
-      <w:r>
-        <w:t>gRPC</w:t>
-      </w:r>
-      <w:proofErr w:type="spellEnd"/>
-      <w:r>
-        <w:t xml:space="preserve"> with the world. So, a monkey can be in a different machine.</w:t>
+        <w:t xml:space="preserve"> runs as a process. Each monkey communicates via gRPC with the world. So, a monkey can be in a different machine.</w:t>
       </w:r>
     </w:p>
     <w:p>
@@ -4490,7 +4230,6 @@
         </w:numPr>
       </w:pPr>
       <w:r>
-        <w:lastRenderedPageBreak/>
         <w:t>We are designing only version A. We ignore other versions for now. They are stated as reference for the future.</w:t>
       </w:r>
     </w:p>
@@ -4519,34 +4258,14 @@
         <w:t xml:space="preserve">snapshot </w:t>
       </w:r>
       <w:r>
-        <w:t xml:space="preserve">of </w:t>
-      </w:r>
-      <w:r>
-        <w:t>slots</w:t>
-      </w:r>
-      <w:r>
-        <w:t xml:space="preserve"> of</w:t>
+        <w:t>of slots of</w:t>
       </w:r>
       <w:r>
         <w:rPr>
           <w:b/>
           <w:bCs/>
         </w:rPr>
-        <w:t xml:space="preserve"> board current</w:t>
-      </w:r>
-      <w:r>
-        <w:rPr>
-          <w:b/>
-          <w:bCs/>
-        </w:rPr>
-        <w:t xml:space="preserve"> state</w:t>
-      </w:r>
-      <w:r>
-        <w:rPr>
-          <w:b/>
-          <w:bCs/>
-        </w:rPr>
-        <w:t xml:space="preserve"> for</w:t>
+        <w:t xml:space="preserve"> board current state for</w:t>
       </w:r>
       <w:r>
         <w:rPr>
@@ -4570,7 +4289,7 @@
       </w:r>
       <w:r>
         <w:pict w14:anchorId="0985878E">
-          <v:rect id="_x0000_i1041" style="width:0;height:1.5pt" o:hralign="center" o:hrstd="t" o:hr="t" fillcolor="#a0a0a0" stroked="f"/>
+          <v:rect id="_x0000_i1042" style="width:0;height:1.5pt" o:hralign="center" o:hrstd="t" o:hr="t" fillcolor="#a0a0a0" stroked="f"/>
         </w:pict>
       </w:r>
     </w:p>
@@ -4873,6 +4592,7 @@
                 <w:b/>
                 <w:bCs/>
               </w:rPr>
+              <w:lastRenderedPageBreak/>
               <w:t>Control</w:t>
             </w:r>
           </w:p>
@@ -5131,7 +4851,6 @@
                 <w:b/>
                 <w:bCs/>
               </w:rPr>
-              <w:lastRenderedPageBreak/>
               <w:t>Parameter</w:t>
             </w:r>
           </w:p>
@@ -5319,7 +5038,6 @@
             <w:hideMark/>
           </w:tcPr>
           <w:p>
-            <w:proofErr w:type="spellStart"/>
             <w:r>
               <w:rPr>
                 <w:b/>
@@ -5327,7 +5045,6 @@
               </w:rPr>
               <w:t>X_strength</w:t>
             </w:r>
-            <w:proofErr w:type="spellEnd"/>
           </w:p>
         </w:tc>
         <w:tc>
@@ -5364,7 +5081,6 @@
             <w:hideMark/>
           </w:tcPr>
           <w:p>
-            <w:proofErr w:type="spellStart"/>
             <w:r>
               <w:rPr>
                 <w:b/>
@@ -5372,7 +5088,6 @@
               </w:rPr>
               <w:t>X_mating_cost</w:t>
             </w:r>
-            <w:proofErr w:type="spellEnd"/>
           </w:p>
         </w:tc>
         <w:tc>
@@ -5409,7 +5124,6 @@
             <w:hideMark/>
           </w:tcPr>
           <w:p>
-            <w:proofErr w:type="spellStart"/>
             <w:r>
               <w:rPr>
                 <w:b/>
@@ -5417,7 +5131,6 @@
               </w:rPr>
               <w:t>X_combat_gain</w:t>
             </w:r>
-            <w:proofErr w:type="spellEnd"/>
           </w:p>
         </w:tc>
         <w:tc>
@@ -5459,7 +5172,6 @@
                 <w:bCs/>
               </w:rPr>
             </w:pPr>
-            <w:proofErr w:type="spellStart"/>
             <w:r>
               <w:rPr>
                 <w:b/>
@@ -5467,7 +5179,6 @@
               </w:rPr>
               <w:t>sigma_combat</w:t>
             </w:r>
-            <w:proofErr w:type="spellEnd"/>
           </w:p>
         </w:tc>
         <w:tc>
@@ -5503,7 +5214,6 @@
             <w:hideMark/>
           </w:tcPr>
           <w:p>
-            <w:proofErr w:type="spellStart"/>
             <w:r>
               <w:rPr>
                 <w:b/>
@@ -5511,7 +5221,6 @@
               </w:rPr>
               <w:t>σ_mutation</w:t>
             </w:r>
-            <w:proofErr w:type="spellEnd"/>
           </w:p>
         </w:tc>
         <w:tc>
@@ -5548,7 +5257,6 @@
             <w:hideMark/>
           </w:tcPr>
           <w:p>
-            <w:proofErr w:type="spellStart"/>
             <w:r>
               <w:rPr>
                 <w:b/>
@@ -5556,7 +5264,6 @@
               </w:rPr>
               <w:t>σ_init</w:t>
             </w:r>
-            <w:proofErr w:type="spellEnd"/>
           </w:p>
         </w:tc>
         <w:tc>
@@ -5593,7 +5300,6 @@
             <w:hideMark/>
           </w:tcPr>
           <w:p>
-            <w:proofErr w:type="spellStart"/>
             <w:r>
               <w:rPr>
                 <w:b/>
@@ -5601,7 +5307,6 @@
               </w:rPr>
               <w:t>Population_count</w:t>
             </w:r>
-            <w:proofErr w:type="spellEnd"/>
           </w:p>
         </w:tc>
         <w:tc>
@@ -5943,6 +5648,7 @@
                 <w:bCs w:val="0"/>
                 <w:lang w:val="en-US"/>
               </w:rPr>
+              <w:lastRenderedPageBreak/>
               <w:t>Board occupancy %</w:t>
             </w:r>
           </w:p>
@@ -9975,6 +9681,7 @@
   <w:style w:type="character" w:default="1" w:styleId="DefaultParagraphFont">
     <w:name w:val="Default Paragraph Font"/>
     <w:uiPriority w:val="1"/>
+    <w:semiHidden/>
     <w:unhideWhenUsed/>
   </w:style>
   <w:style w:type="table" w:default="1" w:styleId="TableNormal">

</xml_diff>